<commit_message>
Use numbered reference points in proposal
</commit_message>
<xml_diff>
--- a/LKS_Usulan_Topik_Capstone_Supervisory_Agent_5G_SA.docx
+++ b/LKS_Usulan_Topik_Capstone_Supervisory_Agent_5G_SA.docx
@@ -1291,152 +1291,142 @@
     </w:p>
     <w:p>
       <w:pPr>
-        <w:spacing w:before="0" w:after="60"/>
+        <w:spacing w:before="0" w:after="100"/>
         <w:ind w:left="403" w:hanging="403"/>
         <w:jc w:val="left"/>
       </w:pPr>
       <w:r>
         <w:rPr>
           <w:rFonts w:ascii="Times New Roman" w:hAnsi="Times New Roman"/>
-          <w:b w:val="0"/>
           <w:sz w:val="19"/>
         </w:rPr>
-        <w:t>[1] M. Dzaferagic et al., “ML-Based Handover Prediction Over a Real O-RAN Deployment Using RAN Intelligent Controller,” IEEE Transactions on Network and Service Management, vol. 22, no. 1, pp. 635–647, 2025, doi: 10.1109/TNSM.2024.3468910.</w:t>
+        <w:t>1. M. Dzaferagic et al., “ML-Based Handover Prediction Over a Real O-RAN Deployment Using RAN Intelligent Controller,” IEEE Transactions on Network and Service Management, vol. 22, no. 1, pp. 635–647, 2025, doi: 10.1109/TNSM.2024.3468910.</w:t>
       </w:r>
     </w:p>
     <w:p>
       <w:pPr>
-        <w:spacing w:before="0" w:after="60"/>
+        <w:spacing w:before="0" w:after="100"/>
         <w:ind w:left="403" w:hanging="403"/>
         <w:jc w:val="left"/>
       </w:pPr>
       <w:r>
         <w:rPr>
           <w:rFonts w:ascii="Times New Roman" w:hAnsi="Times New Roman"/>
-          <w:b w:val="0"/>
           <w:sz w:val="19"/>
         </w:rPr>
-        <w:t>[2] J. P. S. H. Lima et al., “User-Level Handover Decision Making Based on Machine Learning Approaches,” Journal of Communication and Information Systems, vol. 37, no. 1, pp. 104–108, 2022, doi: 10.14209/jcis.2022.11.</w:t>
+        <w:t>2. J. P. S. H. Lima et al., “User-Level Handover Decision Making Based on Machine Learning Approaches,” Journal of Communication and Information Systems, vol. 37, no. 1, pp. 104–108, 2022, doi: 10.14209/jcis.2022.11.</w:t>
       </w:r>
     </w:p>
     <w:p>
       <w:pPr>
-        <w:spacing w:before="0" w:after="60"/>
+        <w:spacing w:before="0" w:after="100"/>
         <w:ind w:left="403" w:hanging="403"/>
         <w:jc w:val="left"/>
       </w:pPr>
       <w:r>
         <w:rPr>
           <w:rFonts w:ascii="Times New Roman" w:hAnsi="Times New Roman"/>
-          <w:b w:val="0"/>
           <w:sz w:val="19"/>
         </w:rPr>
-        <w:t>[3] A. Costa et al., “Skipping-Based Handover Algorithm for Video Distribution over Ultra-Dense VANET,” Computer Networks, vol. 176, art. 107252, 2020, doi: 10.1016/j.comnet.2020.107252.</w:t>
+        <w:t>3. A. Costa et al., “Skipping-Based Handover Algorithm for Video Distribution over Ultra-Dense VANET,” Computer Networks, vol. 176, art. 107252, 2020, doi: 10.1016/j.comnet.2020.107252.</w:t>
       </w:r>
     </w:p>
     <w:p>
       <w:pPr>
-        <w:spacing w:before="0" w:after="60"/>
+        <w:spacing w:before="0" w:after="100"/>
         <w:ind w:left="403" w:hanging="403"/>
         <w:jc w:val="left"/>
       </w:pPr>
       <w:r>
         <w:rPr>
           <w:rFonts w:ascii="Times New Roman" w:hAnsi="Times New Roman"/>
-          <w:b w:val="0"/>
           <w:sz w:val="19"/>
         </w:rPr>
-        <w:t>[4] J. He et al., “A Reinforcement Learning Handover Parameter Adaptation Method Based on LSTM-Aided Digital Twin for UDN,” Sensors, vol. 23, no. 4, art. 2191, 2023, doi: 10.3390/s23042191.</w:t>
+        <w:t>4. J. He et al., “A Reinforcement Learning Handover Parameter Adaptation Method Based on LSTM-Aided Digital Twin for UDN,” Sensors, vol. 23, no. 4, art. 2191, 2023, doi: 10.3390/s23042191.</w:t>
       </w:r>
     </w:p>
     <w:p>
       <w:pPr>
-        <w:spacing w:before="0" w:after="60"/>
+        <w:spacing w:before="0" w:after="100"/>
         <w:ind w:left="403" w:hanging="403"/>
         <w:jc w:val="left"/>
       </w:pPr>
       <w:r>
         <w:rPr>
           <w:rFonts w:ascii="Times New Roman" w:hAnsi="Times New Roman"/>
-          <w:b w:val="0"/>
           <w:sz w:val="19"/>
         </w:rPr>
-        <w:t>[5] M. Helmy et al., “Autoformer-Based Mobility and Handoff-Aware Prediction for QoE Enhancement in Adaptive Video Streaming in 4G/5G Networks,” Journal of Network and Computer Applications, vol. 243, art. 104324, 2025, doi: 10.1016/j.jnca.2025.104324.</w:t>
+        <w:t>5. M. Helmy et al., “Autoformer-Based Mobility and Handoff-Aware Prediction for QoE Enhancement in Adaptive Video Streaming in 4G/5G Networks,” Journal of Network and Computer Applications, vol. 243, art. 104324, 2025, doi: 10.1016/j.jnca.2025.104324.</w:t>
       </w:r>
     </w:p>
     <w:p>
       <w:pPr>
-        <w:spacing w:before="0" w:after="60"/>
+        <w:spacing w:before="0" w:after="100"/>
         <w:ind w:left="403" w:hanging="403"/>
         <w:jc w:val="left"/>
       </w:pPr>
       <w:r>
         <w:rPr>
           <w:rFonts w:ascii="Times New Roman" w:hAnsi="Times New Roman"/>
-          <w:b w:val="0"/>
           <w:sz w:val="19"/>
         </w:rPr>
-        <w:t>[6] M. J. Sanjarani et al., “Handover Reduction in 5G Mobile Networks Using Ensemble Learning Method,” Scientific Reports, 2026, doi: 10.1038/s41598-026-73269-1.</w:t>
+        <w:t>6. M. J. Sanjarani et al., “Handover Reduction in 5G Mobile Networks Using Ensemble Learning Method,” Scientific Reports, 2026, doi: 10.1038/s41598-026-73269-1.</w:t>
       </w:r>
     </w:p>
     <w:p>
       <w:pPr>
-        <w:spacing w:before="0" w:after="60"/>
+        <w:spacing w:before="0" w:after="100"/>
         <w:ind w:left="403" w:hanging="403"/>
         <w:jc w:val="left"/>
       </w:pPr>
       <w:r>
         <w:rPr>
           <w:rFonts w:ascii="Times New Roman" w:hAnsi="Times New Roman"/>
-          <w:b w:val="0"/>
           <w:sz w:val="19"/>
         </w:rPr>
-        <w:t>[7] M. S. Mollel et al., “A Survey of Machine Learning Applications to Handover Management in 5G and Beyond,” IEEE Access, vol. 9, pp. 45770–45802, 2021, doi: 10.1109/ACCESS.2021.3067503.</w:t>
+        <w:t>7. M. S. Mollel et al., “A Survey of Machine Learning Applications to Handover Management in 5G and Beyond,” IEEE Access, vol. 9, pp. 45770–45802, 2021, doi: 10.1109/ACCESS.2021.3067503.</w:t>
       </w:r>
     </w:p>
     <w:p>
       <w:pPr>
-        <w:spacing w:before="0" w:after="60"/>
+        <w:spacing w:before="0" w:after="100"/>
         <w:ind w:left="403" w:hanging="403"/>
         <w:jc w:val="left"/>
       </w:pPr>
       <w:r>
         <w:rPr>
           <w:rFonts w:ascii="Times New Roman" w:hAnsi="Times New Roman"/>
-          <w:b w:val="0"/>
           <w:sz w:val="19"/>
         </w:rPr>
-        <w:t>[8] M. Polese et al., “Understanding O-RAN: Architecture, Interfaces, Algorithms, Security, and Research Challenges,” IEEE Communications Surveys &amp; Tutorials, vol. 25, no. 2, pp. 1376–1411, 2023, doi: 10.1109/COMST.2023.3239220.</w:t>
+        <w:t>8. M. Polese et al., “Understanding O-RAN: Architecture, Interfaces, Algorithms, Security, and Research Challenges,” IEEE Communications Surveys &amp; Tutorials, vol. 25, no. 2, pp. 1376–1411, 2023, doi: 10.1109/COMST.2023.3239220.</w:t>
       </w:r>
     </w:p>
     <w:p>
       <w:pPr>
-        <w:spacing w:before="0" w:after="60"/>
+        <w:spacing w:before="0" w:after="100"/>
         <w:ind w:left="403" w:hanging="403"/>
         <w:jc w:val="left"/>
       </w:pPr>
       <w:r>
         <w:rPr>
           <w:rFonts w:ascii="Times New Roman" w:hAnsi="Times New Roman"/>
-          <w:b w:val="0"/>
           <w:sz w:val="19"/>
         </w:rPr>
-        <w:t>[9] L. Wang et al., “A Survey on Large Language Model Based Autonomous Agents,” Frontiers of Computer Science, vol. 18, art. 186345, 2024, doi: 10.1007/s11704-024-40231-1.</w:t>
+        <w:t>9. L. Wang et al., “A Survey on Large Language Model Based Autonomous Agents,” Frontiers of Computer Science, vol. 18, art. 186345, 2024, doi: 10.1007/s11704-024-40231-1.</w:t>
       </w:r>
     </w:p>
     <w:p>
       <w:pPr>
-        <w:spacing w:before="0" w:after="60"/>
+        <w:spacing w:before="0" w:after="100"/>
         <w:ind w:left="403" w:hanging="403"/>
         <w:jc w:val="left"/>
       </w:pPr>
       <w:r>
         <w:rPr>
           <w:rFonts w:ascii="Times New Roman" w:hAnsi="Times New Roman"/>
-          <w:b w:val="0"/>
           <w:sz w:val="19"/>
         </w:rPr>
-        <w:t>[10] S. Park et al., “ZEUS: Handover Algorithm for 5G to Achieve Zero Handover Failure,” ETRI Journal, 2022, doi: 10.4218/etrij.2020-0356.</w:t>
+        <w:t>10. S. Park et al., “ZEUS: Handover Algorithm for 5G to Achieve Zero Handover Failure,” ETRI Journal, 2022, doi: 10.4218/etrij.2020-0356.</w:t>
       </w:r>
     </w:p>
     <w:p>
@@ -1455,92 +1445,86 @@
     </w:p>
     <w:p>
       <w:pPr>
-        <w:spacing w:before="0" w:after="60"/>
+        <w:spacing w:before="0" w:after="100"/>
         <w:ind w:left="403" w:hanging="403"/>
         <w:jc w:val="left"/>
       </w:pPr>
       <w:r>
         <w:rPr>
           <w:rFonts w:ascii="Times New Roman" w:hAnsi="Times New Roman"/>
-          <w:b w:val="0"/>
           <w:sz w:val="19"/>
         </w:rPr>
-        <w:t>[11] 3GPP, “NR; Radio Resource Control (RRC); Protocol specification,” 3GPP TS 38.331, Release 17. [Online]. Available: https://www.3gpp.org/DynaReport/38331.htm</w:t>
+        <w:t>11. 3GPP, “NR; Radio Resource Control (RRC); Protocol specification,” 3GPP TS 38.331, Release 17. [Online]. Available: https://www.3gpp.org/DynaReport/38331.htm</w:t>
       </w:r>
     </w:p>
     <w:p>
       <w:pPr>
-        <w:spacing w:before="0" w:after="60"/>
+        <w:spacing w:before="0" w:after="100"/>
         <w:ind w:left="403" w:hanging="403"/>
         <w:jc w:val="left"/>
       </w:pPr>
       <w:r>
         <w:rPr>
           <w:rFonts w:ascii="Times New Roman" w:hAnsi="Times New Roman"/>
-          <w:b w:val="0"/>
           <w:sz w:val="19"/>
         </w:rPr>
-        <w:t>[12] 3GPP, “NR; NR and NG-RAN Overall Description; Stage-2,” 3GPP TS 38.300, Release 17. [Online]. Available: https://www.3gpp.org/DynaReport/38300.htm</w:t>
+        <w:t>12. 3GPP, “NR; NR and NG-RAN Overall Description; Stage-2,” 3GPP TS 38.300, Release 17. [Online]. Available: https://www.3gpp.org/DynaReport/38300.htm</w:t>
       </w:r>
     </w:p>
     <w:p>
       <w:pPr>
-        <w:spacing w:before="0" w:after="60"/>
+        <w:spacing w:before="0" w:after="100"/>
         <w:ind w:left="403" w:hanging="403"/>
         <w:jc w:val="left"/>
       </w:pPr>
       <w:r>
         <w:rPr>
           <w:rFonts w:ascii="Times New Roman" w:hAnsi="Times New Roman"/>
-          <w:b w:val="0"/>
           <w:sz w:val="19"/>
         </w:rPr>
-        <w:t>[13] Open5GS, “Open5GS Documentation.” [Online]. Available: https://open5gs.org/open5gs/docs/</w:t>
+        <w:t>13. Open5GS, “Open5GS Documentation.” [Online]. Available: https://open5gs.org/open5gs/docs/</w:t>
       </w:r>
     </w:p>
     <w:p>
       <w:pPr>
-        <w:spacing w:before="0" w:after="60"/>
+        <w:spacing w:before="0" w:after="100"/>
         <w:ind w:left="403" w:hanging="403"/>
         <w:jc w:val="left"/>
       </w:pPr>
       <w:r>
         <w:rPr>
           <w:rFonts w:ascii="Times New Roman" w:hAnsi="Times New Roman"/>
-          <w:b w:val="0"/>
           <w:sz w:val="19"/>
         </w:rPr>
-        <w:t>[14] srsRAN Project, “Handover Tutorial.” [Online]. Available: https://docs.srsran.com/projects/project/en/latest/tutorials/source/handover/source/index.html</w:t>
+        <w:t>14. srsRAN Project, “Handover Tutorial.” [Online]. Available: https://docs.srsran.com/projects/project/en/latest/tutorials/source/handover/source/index.html</w:t>
       </w:r>
     </w:p>
     <w:p>
       <w:pPr>
-        <w:spacing w:before="0" w:after="60"/>
+        <w:spacing w:before="0" w:after="100"/>
         <w:ind w:left="403" w:hanging="403"/>
         <w:jc w:val="left"/>
       </w:pPr>
       <w:r>
         <w:rPr>
           <w:rFonts w:ascii="Times New Roman" w:hAnsi="Times New Roman"/>
-          <w:b w:val="0"/>
           <w:sz w:val="19"/>
         </w:rPr>
-        <w:t>[15] OpenAirInterface, “Handover Tutorial.” [Online]. Available: https://github.com/OPENAIRINTERFACE/openairinterface5g/blob/develop/doc/handover-tutorial.md</w:t>
+        <w:t>15. OpenAirInterface, “Handover Tutorial.” [Online]. Available: https://github.com/OPENAIRINTERFACE/openairinterface5g/blob/develop/doc/handover-tutorial.md</w:t>
       </w:r>
     </w:p>
     <w:p>
       <w:pPr>
-        <w:spacing w:before="0" w:after="60"/>
+        <w:spacing w:before="0" w:after="100"/>
         <w:ind w:left="403" w:hanging="403"/>
         <w:jc w:val="left"/>
       </w:pPr>
       <w:r>
         <w:rPr>
           <w:rFonts w:ascii="Times New Roman" w:hAnsi="Times New Roman"/>
-          <w:b w:val="0"/>
           <w:sz w:val="19"/>
         </w:rPr>
-        <w:t>[16] Ettus Research, “USRP B2x0 Series User Manual.” [Online]. Available: https://files.ettus.com/manual/page_usrp_b200.html</w:t>
+        <w:t>16. Ettus Research, “USRP B2x0 Series User Manual.” [Online]. Available: https://files.ettus.com/manual/page_usrp_b200.html</w:t>
       </w:r>
     </w:p>
     <w:p>

</xml_diff>